<commit_message>
목동중2 초압축본(Core) 5-⑤: 빈칸 일부를 어법 선택형으로 (visit/visit to, live/lively, telling/telling to 등 9곳) · 허브 ?v= 갱신
Co-Authored-By: Claude Opus 5.5 <noreply@anthropic.com>
Claude-Session: https://claude.ai/code/session_01RrqjoVTovmrCHyVJ1dxdn3
</commit_message>
<xml_diff>
--- a/mokdong2/2fin/word/MDJ2_L5-L7_ByPart_Core_A4.docx
+++ b/mokdong2/2fin/word/MDJ2_L5-L7_ByPart_Core_A4.docx
@@ -156,7 +156,7 @@
           <w:color w:val="1F2430"/>
           <w:sz w:val="21"/>
         </w:rPr>
-        <w:t xml:space="preserve">Modern street art comes in many different forms, and it makes cities colorful and </w:t>
+        <w:t xml:space="preserve">Modern street art comes in many different forms, and it makes cities colorful and ( live / </w:t>
       </w:r>
       <w:r>
         <w:rPr>
@@ -164,6 +164,7 @@
           <w:b/>
           <w:color w:val="D1323A"/>
           <w:sz w:val="21"/>
+          <w:u w:val="single"/>
         </w:rPr>
         <w:t>lively</w:t>
       </w:r>
@@ -174,7 +175,7 @@
           <w:color w:val="1F2430"/>
           <w:sz w:val="21"/>
         </w:rPr>
-        <w:t>.</w:t>
+        <w:t xml:space="preserve"> ).</w:t>
       </w:r>
     </w:p>
     <w:p>
@@ -238,7 +239,7 @@
           <w:color w:val="1F2430"/>
           <w:sz w:val="21"/>
         </w:rPr>
-        <w:t xml:space="preserve">The place that we are going to </w:t>
+        <w:t xml:space="preserve">The place that we are going to ( </w:t>
       </w:r>
       <w:r>
         <w:rPr>
@@ -246,6 +247,7 @@
           <w:b/>
           <w:color w:val="D1323A"/>
           <w:sz w:val="21"/>
+          <w:u w:val="single"/>
         </w:rPr>
         <w:t>visit</w:t>
       </w:r>
@@ -256,7 +258,7 @@
           <w:color w:val="1F2430"/>
           <w:sz w:val="21"/>
         </w:rPr>
-        <w:t xml:space="preserve"> is Shoreditch.</w:t>
+        <w:t xml:space="preserve"> / visit to ) is Shoreditch.</w:t>
       </w:r>
     </w:p>
     <w:p>
@@ -320,7 +322,7 @@
           <w:color w:val="1F2430"/>
           <w:sz w:val="21"/>
         </w:rPr>
-        <w:t xml:space="preserve">Poor workers </w:t>
+        <w:t xml:space="preserve">Poor workers ( </w:t>
       </w:r>
       <w:r>
         <w:rPr>
@@ -328,6 +330,7 @@
           <w:b/>
           <w:color w:val="D1323A"/>
           <w:sz w:val="21"/>
+          <w:u w:val="single"/>
         </w:rPr>
         <w:t>used to live</w:t>
       </w:r>
@@ -338,7 +341,7 @@
           <w:color w:val="1F2430"/>
           <w:sz w:val="21"/>
         </w:rPr>
-        <w:t xml:space="preserve"> in this area, but now it is one of the hippest </w:t>
+        <w:t xml:space="preserve"> / are used to living ) in this area, but now it is one of the hippest ( area / </w:t>
       </w:r>
       <w:r>
         <w:rPr>
@@ -346,6 +349,7 @@
           <w:b/>
           <w:color w:val="D1323A"/>
           <w:sz w:val="21"/>
+          <w:u w:val="single"/>
         </w:rPr>
         <w:t>areas</w:t>
       </w:r>
@@ -356,7 +360,7 @@
           <w:color w:val="1F2430"/>
           <w:sz w:val="21"/>
         </w:rPr>
-        <w:t xml:space="preserve"> in London.</w:t>
+        <w:t xml:space="preserve"> ) in London.</w:t>
       </w:r>
     </w:p>
     <w:p>
@@ -502,7 +506,7 @@
           <w:color w:val="1F2430"/>
           <w:sz w:val="21"/>
         </w:rPr>
-        <w:t xml:space="preserve"> </w:t>
+        <w:t xml:space="preserve"> ( use / </w:t>
       </w:r>
       <w:r>
         <w:rPr>
@@ -510,6 +514,7 @@
           <w:b/>
           <w:color w:val="D1323A"/>
           <w:sz w:val="21"/>
+          <w:u w:val="single"/>
         </w:rPr>
         <w:t>using</w:t>
       </w:r>
@@ -520,7 +525,7 @@
           <w:color w:val="1F2430"/>
           <w:sz w:val="21"/>
         </w:rPr>
-        <w:t xml:space="preserve"> only lines and dots in his paintings of human bodies.</w:t>
+        <w:t xml:space="preserve"> ) only lines and dots in his paintings of human bodies.</w:t>
       </w:r>
     </w:p>
     <w:p>
@@ -721,7 +726,7 @@
           <w:color w:val="1F2430"/>
           <w:sz w:val="21"/>
         </w:rPr>
-        <w:t xml:space="preserve">We are now in Finsbury Park </w:t>
+        <w:t xml:space="preserve">We are now in Finsbury Park ( see / </w:t>
       </w:r>
       <w:r>
         <w:rPr>
@@ -729,6 +734,7 @@
           <w:b/>
           <w:color w:val="D1323A"/>
           <w:sz w:val="21"/>
+          <w:u w:val="single"/>
         </w:rPr>
         <w:t>to see</w:t>
       </w:r>
@@ -739,7 +745,7 @@
           <w:color w:val="1F2430"/>
           <w:sz w:val="21"/>
         </w:rPr>
-        <w:t xml:space="preserve"> a painting by Banksy, an internationally famous street artist.</w:t>
+        <w:t xml:space="preserve"> ) a painting by Banksy, an internationally famous street artist.</w:t>
       </w:r>
     </w:p>
     <w:p>
@@ -1022,7 +1028,7 @@
           <w:color w:val="1F2430"/>
           <w:sz w:val="21"/>
         </w:rPr>
-        <w:t xml:space="preserve">, he is </w:t>
+        <w:t xml:space="preserve">, he is ( </w:t>
       </w:r>
       <w:r>
         <w:rPr>
@@ -1030,6 +1036,7 @@
           <w:b/>
           <w:color w:val="D1323A"/>
           <w:sz w:val="21"/>
+          <w:u w:val="single"/>
         </w:rPr>
         <w:t>telling</w:t>
       </w:r>
@@ -1040,7 +1047,7 @@
           <w:color w:val="1F2430"/>
           <w:sz w:val="21"/>
         </w:rPr>
-        <w:t xml:space="preserve"> us that nature is having a hard time.</w:t>
+        <w:t xml:space="preserve"> / telling to ) us that nature is having a hard time.</w:t>
       </w:r>
     </w:p>
     <w:p>
@@ -1104,7 +1111,7 @@
           <w:color w:val="1F2430"/>
           <w:sz w:val="21"/>
         </w:rPr>
-        <w:t xml:space="preserve">They think he wants us to </w:t>
+        <w:t xml:space="preserve">They think he wants us ( take / </w:t>
       </w:r>
       <w:r>
         <w:rPr>
@@ -1112,8 +1119,45 @@
           <w:b/>
           <w:color w:val="D1323A"/>
           <w:sz w:val="21"/>
-        </w:rPr>
-        <w:t>take better care of</w:t>
+          <w:u w:val="single"/>
+        </w:rPr>
+        <w:t>to take</w:t>
+      </w:r>
+      <w:r>
+        <w:rPr>
+          <w:rFonts w:ascii="맑은 고딕" w:hAnsi="맑은 고딕" w:eastAsia="맑은 고딕"/>
+          <w:b w:val="0"/>
+          <w:color w:val="1F2430"/>
+          <w:sz w:val="21"/>
+        </w:rPr>
+        <w:t xml:space="preserve"> ) </w:t>
+      </w:r>
+      <w:r>
+        <w:rPr>
+          <w:rFonts w:ascii="맑은 고딕" w:hAnsi="맑은 고딕" w:eastAsia="맑은 고딕"/>
+          <w:b/>
+          <w:color w:val="D1323A"/>
+          <w:sz w:val="21"/>
+        </w:rPr>
+        <w:t>better</w:t>
+      </w:r>
+      <w:r>
+        <w:rPr>
+          <w:rFonts w:ascii="맑은 고딕" w:hAnsi="맑은 고딕" w:eastAsia="맑은 고딕"/>
+          <w:b w:val="0"/>
+          <w:color w:val="1F2430"/>
+          <w:sz w:val="21"/>
+        </w:rPr>
+        <w:t xml:space="preserve"> care </w:t>
+      </w:r>
+      <w:r>
+        <w:rPr>
+          <w:rFonts w:ascii="맑은 고딕" w:hAnsi="맑은 고딕" w:eastAsia="맑은 고딕"/>
+          <w:b/>
+          <w:color w:val="D1323A"/>
+          <w:sz w:val="21"/>
+        </w:rPr>
+        <w:t>of</w:t>
       </w:r>
       <w:r>
         <w:rPr>
@@ -1195,7 +1239,7 @@
           <w:color w:val="D1323A"/>
           <w:sz w:val="21"/>
         </w:rPr>
-        <w:t>is well known for</w:t>
+        <w:t>is well known</w:t>
       </w:r>
       <w:r>
         <w:rPr>
@@ -1204,7 +1248,26 @@
           <w:color w:val="1F2430"/>
           <w:sz w:val="21"/>
         </w:rPr>
-        <w:t xml:space="preserve"> painting pictures on gum that people drop on the street.</w:t>
+        <w:t xml:space="preserve"> ( </w:t>
+      </w:r>
+      <w:r>
+        <w:rPr>
+          <w:rFonts w:ascii="맑은 고딕" w:hAnsi="맑은 고딕" w:eastAsia="맑은 고딕"/>
+          <w:b/>
+          <w:color w:val="D1323A"/>
+          <w:sz w:val="21"/>
+          <w:u w:val="single"/>
+        </w:rPr>
+        <w:t>for</w:t>
+      </w:r>
+      <w:r>
+        <w:rPr>
+          <w:rFonts w:ascii="맑은 고딕" w:hAnsi="맑은 고딕" w:eastAsia="맑은 고딕"/>
+          <w:b w:val="0"/>
+          <w:color w:val="1F2430"/>
+          <w:sz w:val="21"/>
+        </w:rPr>
+        <w:t xml:space="preserve"> / as ) painting pictures on gum that people drop on the street.</w:t>
       </w:r>
     </w:p>
     <w:p>
@@ -1332,7 +1395,7 @@
           <w:color w:val="1F2430"/>
           <w:sz w:val="21"/>
         </w:rPr>
-        <w:t xml:space="preserve">Wilson's gum paintings are tiny, </w:t>
+        <w:t xml:space="preserve">Wilson's gum paintings are tiny, ( so / </w:t>
       </w:r>
       <w:r>
         <w:rPr>
@@ -1340,6 +1403,7 @@
           <w:b/>
           <w:color w:val="D1323A"/>
           <w:sz w:val="21"/>
+          <w:u w:val="single"/>
         </w:rPr>
         <w:t>but</w:t>
       </w:r>
@@ -1350,7 +1414,7 @@
           <w:color w:val="1F2430"/>
           <w:sz w:val="21"/>
         </w:rPr>
-        <w:t xml:space="preserve"> they give great pleasure </w:t>
+        <w:t xml:space="preserve"> ) they give great pleasure ( </w:t>
       </w:r>
       <w:r>
         <w:rPr>
@@ -1358,6 +1422,7 @@
           <w:b/>
           <w:color w:val="D1323A"/>
           <w:sz w:val="21"/>
+          <w:u w:val="single"/>
         </w:rPr>
         <w:t>to</w:t>
       </w:r>
@@ -1368,7 +1433,7 @@
           <w:color w:val="1F2430"/>
           <w:sz w:val="21"/>
         </w:rPr>
-        <w:t xml:space="preserve"> many people.</w:t>
+        <w:t xml:space="preserve"> / for ) many people.</w:t>
       </w:r>
     </w:p>
     <w:p>

</xml_diff>